<commit_message>
Strip pricing and internal-deliberation material from both documents
Handbook: section 5-7 (the open-questions list, which led with fee and
rate design) is gone. Those decisions belong in the private design memo,
not in a document sitting in a public repo.

Curriculum design doc: chapter 7 was "料金と時間の設計例" and carried an
instructor-facing note on how to price the course, inside a document that
is handed to clients. It is now "提供パターン" — the four package options
and the subsidy requirement, with the instructor-effort column and the
pricing advice removed.

Both rebuilt: handbook 49pp, design doc 25pp, XSD-valid.

Co-Authored-By: Claude Opus 5 <noreply@anthropic.com>
Claude-Session: https://claude.ai/code/session_01BnqgQK1cdpwnR7CaS1h7Tu
</commit_message>
<xml_diff>
--- a/docs/AI実装講座_1対1版_カリキュラム設計書.docx
+++ b/docs/AI実装講座_1対1版_カリキュラム設計書.docx
@@ -1387,7 +1387,7 @@
                 <w:sz w:val="19"/>
                 <w:szCs w:val="19"/>
               </w:rPr>
-              <w:t xml:space="preserve">料金と時間の設計例</w:t>
+              <w:t xml:space="preserve">提供パターン</w:t>
             </w:r>
           </w:p>
         </w:tc>
@@ -1418,7 +1418,7 @@
                 <w:sz w:val="19"/>
                 <w:szCs w:val="19"/>
               </w:rPr>
-              <w:t xml:space="preserve">3つの提供パターンと単価の考え方</w:t>
+              <w:t xml:space="preserve">4つの提供パターンと、助成金を使う場合の要件</w:t>
             </w:r>
           </w:p>
         </w:tc>
@@ -1547,8 +1547,8 @@
       <w:pPr>
         <w:pBdr>
           <w:top w:val="single" w:color="FFE599" w:sz="2" w:space="4"/>
+          <w:left w:val="single" w:color="C00000" w:sz="18" w:space="6"/>
           <w:bottom w:val="single" w:color="FFE599" w:sz="2" w:space="4"/>
-          <w:left w:val="single" w:color="C00000" w:sz="18" w:space="6"/>
           <w:right w:val="single" w:color="FFE599" w:sz="2" w:space="4"/>
         </w:pBdr>
         <w:shd w:fill="FFF2CC" w:color="auto" w:val="clear"/>
@@ -1670,8 +1670,8 @@
       <w:pPr>
         <w:pBdr>
           <w:top w:val="single" w:color="FFE599" w:sz="2" w:space="4"/>
+          <w:left w:val="single" w:color="C00000" w:sz="18" w:space="6"/>
           <w:bottom w:val="single" w:color="FFE599" w:sz="2" w:space="4"/>
-          <w:left w:val="single" w:color="C00000" w:sz="18" w:space="6"/>
           <w:right w:val="single" w:color="FFE599" w:sz="2" w:space="4"/>
         </w:pBdr>
         <w:shd w:fill="FFF2CC" w:color="auto" w:val="clear"/>
@@ -2614,8 +2614,8 @@
       <w:pPr>
         <w:pBdr>
           <w:top w:val="single" w:color="FFE599" w:sz="2" w:space="4"/>
+          <w:left w:val="single" w:color="C00000" w:sz="18" w:space="6"/>
           <w:bottom w:val="single" w:color="FFE599" w:sz="2" w:space="4"/>
-          <w:left w:val="single" w:color="C00000" w:sz="18" w:space="6"/>
           <w:right w:val="single" w:color="FFE599" w:sz="2" w:space="4"/>
         </w:pBdr>
         <w:shd w:fill="FFF2CC" w:color="auto" w:val="clear"/>
@@ -5436,8 +5436,8 @@
       <w:pPr>
         <w:pBdr>
           <w:top w:val="single" w:color="FFE599" w:sz="2" w:space="4"/>
+          <w:left w:val="single" w:color="C00000" w:sz="18" w:space="6"/>
           <w:bottom w:val="single" w:color="FFE599" w:sz="2" w:space="4"/>
-          <w:left w:val="single" w:color="C00000" w:sz="18" w:space="6"/>
           <w:right w:val="single" w:color="FFE599" w:sz="2" w:space="4"/>
         </w:pBdr>
         <w:shd w:fill="FFF2CC" w:color="auto" w:val="clear"/>
@@ -6218,8 +6218,8 @@
       <w:pPr>
         <w:pBdr>
           <w:top w:val="single" w:color="FFE599" w:sz="2" w:space="4"/>
+          <w:left w:val="single" w:color="C00000" w:sz="18" w:space="6"/>
           <w:bottom w:val="single" w:color="FFE599" w:sz="2" w:space="4"/>
-          <w:left w:val="single" w:color="C00000" w:sz="18" w:space="6"/>
           <w:right w:val="single" w:color="FFE599" w:sz="2" w:space="4"/>
         </w:pBdr>
         <w:shd w:fill="FFF2CC" w:color="auto" w:val="clear"/>
@@ -7340,8 +7340,8 @@
       <w:pPr>
         <w:pBdr>
           <w:top w:val="single" w:color="FFE599" w:sz="2" w:space="4"/>
+          <w:left w:val="single" w:color="C00000" w:sz="18" w:space="6"/>
           <w:bottom w:val="single" w:color="FFE599" w:sz="2" w:space="4"/>
-          <w:left w:val="single" w:color="C00000" w:sz="18" w:space="6"/>
           <w:right w:val="single" w:color="FFE599" w:sz="2" w:space="4"/>
         </w:pBdr>
         <w:shd w:fill="FFF2CC" w:color="auto" w:val="clear"/>
@@ -8288,8 +8288,8 @@
       <w:pPr>
         <w:pBdr>
           <w:top w:val="single" w:color="FFE599" w:sz="2" w:space="4"/>
+          <w:left w:val="single" w:color="C00000" w:sz="18" w:space="6"/>
           <w:bottom w:val="single" w:color="FFE599" w:sz="2" w:space="4"/>
-          <w:left w:val="single" w:color="C00000" w:sz="18" w:space="6"/>
           <w:right w:val="single" w:color="FFE599" w:sz="2" w:space="4"/>
         </w:pBdr>
         <w:shd w:fill="FFF2CC" w:color="auto" w:val="clear"/>
@@ -9236,8 +9236,8 @@
       <w:pPr>
         <w:pBdr>
           <w:top w:val="single" w:color="FFE599" w:sz="2" w:space="4"/>
+          <w:left w:val="single" w:color="C00000" w:sz="18" w:space="6"/>
           <w:bottom w:val="single" w:color="FFE599" w:sz="2" w:space="4"/>
-          <w:left w:val="single" w:color="C00000" w:sz="18" w:space="6"/>
           <w:right w:val="single" w:color="FFE599" w:sz="2" w:space="4"/>
         </w:pBdr>
         <w:shd w:fill="FFF2CC" w:color="auto" w:val="clear"/>
@@ -10184,8 +10184,8 @@
       <w:pPr>
         <w:pBdr>
           <w:top w:val="single" w:color="FFE599" w:sz="2" w:space="4"/>
+          <w:left w:val="single" w:color="C00000" w:sz="18" w:space="6"/>
           <w:bottom w:val="single" w:color="FFE599" w:sz="2" w:space="4"/>
-          <w:left w:val="single" w:color="C00000" w:sz="18" w:space="6"/>
           <w:right w:val="single" w:color="FFE599" w:sz="2" w:space="4"/>
         </w:pBdr>
         <w:shd w:fill="FFF2CC" w:color="auto" w:val="clear"/>
@@ -11132,8 +11132,8 @@
       <w:pPr>
         <w:pBdr>
           <w:top w:val="single" w:color="FFE599" w:sz="2" w:space="4"/>
+          <w:left w:val="single" w:color="C00000" w:sz="18" w:space="6"/>
           <w:bottom w:val="single" w:color="FFE599" w:sz="2" w:space="4"/>
-          <w:left w:val="single" w:color="C00000" w:sz="18" w:space="6"/>
           <w:right w:val="single" w:color="FFE599" w:sz="2" w:space="4"/>
         </w:pBdr>
         <w:shd w:fill="FFF2CC" w:color="auto" w:val="clear"/>
@@ -12080,8 +12080,8 @@
       <w:pPr>
         <w:pBdr>
           <w:top w:val="single" w:color="FFE599" w:sz="2" w:space="4"/>
+          <w:left w:val="single" w:color="C00000" w:sz="18" w:space="6"/>
           <w:bottom w:val="single" w:color="FFE599" w:sz="2" w:space="4"/>
-          <w:left w:val="single" w:color="C00000" w:sz="18" w:space="6"/>
           <w:right w:val="single" w:color="FFE599" w:sz="2" w:space="4"/>
         </w:pBdr>
         <w:shd w:fill="FFF2CC" w:color="auto" w:val="clear"/>
@@ -12199,8 +12199,8 @@
       <w:pPr>
         <w:pBdr>
           <w:top w:val="single" w:color="BBD9D6" w:sz="2" w:space="4"/>
+          <w:left w:val="single" w:color="1F6F6B" w:sz="18" w:space="6"/>
           <w:bottom w:val="single" w:color="BBD9D6" w:sz="2" w:space="4"/>
-          <w:left w:val="single" w:color="1F6F6B" w:sz="18" w:space="6"/>
           <w:right w:val="single" w:color="BBD9D6" w:sz="2" w:space="4"/>
         </w:pBdr>
         <w:shd w:fill="E8F2F1" w:color="auto" w:val="clear"/>
@@ -13147,8 +13147,8 @@
       <w:pPr>
         <w:pBdr>
           <w:top w:val="single" w:color="FFE599" w:sz="2" w:space="4"/>
+          <w:left w:val="single" w:color="C00000" w:sz="18" w:space="6"/>
           <w:bottom w:val="single" w:color="FFE599" w:sz="2" w:space="4"/>
-          <w:left w:val="single" w:color="C00000" w:sz="18" w:space="6"/>
           <w:right w:val="single" w:color="FFE599" w:sz="2" w:space="4"/>
         </w:pBdr>
         <w:shd w:fill="FFF2CC" w:color="auto" w:val="clear"/>
@@ -13186,8 +13186,8 @@
       <w:pPr>
         <w:pBdr>
           <w:top w:val="single" w:color="BBD9D6" w:sz="2" w:space="4"/>
+          <w:left w:val="single" w:color="1F6F6B" w:sz="18" w:space="6"/>
           <w:bottom w:val="single" w:color="BBD9D6" w:sz="2" w:space="4"/>
-          <w:left w:val="single" w:color="1F6F6B" w:sz="18" w:space="6"/>
           <w:right w:val="single" w:color="BBD9D6" w:sz="2" w:space="4"/>
         </w:pBdr>
         <w:shd w:fill="E8F2F1" w:color="auto" w:val="clear"/>
@@ -14134,8 +14134,8 @@
       <w:pPr>
         <w:pBdr>
           <w:top w:val="single" w:color="FFE599" w:sz="2" w:space="4"/>
+          <w:left w:val="single" w:color="C00000" w:sz="18" w:space="6"/>
           <w:bottom w:val="single" w:color="FFE599" w:sz="2" w:space="4"/>
-          <w:left w:val="single" w:color="C00000" w:sz="18" w:space="6"/>
           <w:right w:val="single" w:color="FFE599" w:sz="2" w:space="4"/>
         </w:pBdr>
         <w:shd w:fill="FFF2CC" w:color="auto" w:val="clear"/>
@@ -14173,8 +14173,8 @@
       <w:pPr>
         <w:pBdr>
           <w:top w:val="single" w:color="BBD9D6" w:sz="2" w:space="4"/>
+          <w:left w:val="single" w:color="1F6F6B" w:sz="18" w:space="6"/>
           <w:bottom w:val="single" w:color="BBD9D6" w:sz="2" w:space="4"/>
-          <w:left w:val="single" w:color="1F6F6B" w:sz="18" w:space="6"/>
           <w:right w:val="single" w:color="BBD9D6" w:sz="2" w:space="4"/>
         </w:pBdr>
         <w:shd w:fill="E8F2F1" w:color="auto" w:val="clear"/>
@@ -15121,8 +15121,8 @@
       <w:pPr>
         <w:pBdr>
           <w:top w:val="single" w:color="FFE599" w:sz="2" w:space="4"/>
+          <w:left w:val="single" w:color="C00000" w:sz="18" w:space="6"/>
           <w:bottom w:val="single" w:color="FFE599" w:sz="2" w:space="4"/>
-          <w:left w:val="single" w:color="C00000" w:sz="18" w:space="6"/>
           <w:right w:val="single" w:color="FFE599" w:sz="2" w:space="4"/>
         </w:pBdr>
         <w:shd w:fill="FFF2CC" w:color="auto" w:val="clear"/>
@@ -15160,8 +15160,8 @@
       <w:pPr>
         <w:pBdr>
           <w:top w:val="single" w:color="BBD9D6" w:sz="2" w:space="4"/>
+          <w:left w:val="single" w:color="1F6F6B" w:sz="18" w:space="6"/>
           <w:bottom w:val="single" w:color="BBD9D6" w:sz="2" w:space="4"/>
-          <w:left w:val="single" w:color="1F6F6B" w:sz="18" w:space="6"/>
           <w:right w:val="single" w:color="BBD9D6" w:sz="2" w:space="4"/>
         </w:pBdr>
         <w:shd w:fill="E8F2F1" w:color="auto" w:val="clear"/>
@@ -16108,8 +16108,8 @@
       <w:pPr>
         <w:pBdr>
           <w:top w:val="single" w:color="FFE599" w:sz="2" w:space="4"/>
+          <w:left w:val="single" w:color="C00000" w:sz="18" w:space="6"/>
           <w:bottom w:val="single" w:color="FFE599" w:sz="2" w:space="4"/>
-          <w:left w:val="single" w:color="C00000" w:sz="18" w:space="6"/>
           <w:right w:val="single" w:color="FFE599" w:sz="2" w:space="4"/>
         </w:pBdr>
         <w:shd w:fill="FFF2CC" w:color="auto" w:val="clear"/>
@@ -16147,8 +16147,8 @@
       <w:pPr>
         <w:pBdr>
           <w:top w:val="single" w:color="BBD9D6" w:sz="2" w:space="4"/>
+          <w:left w:val="single" w:color="1F6F6B" w:sz="18" w:space="6"/>
           <w:bottom w:val="single" w:color="BBD9D6" w:sz="2" w:space="4"/>
-          <w:left w:val="single" w:color="1F6F6B" w:sz="18" w:space="6"/>
           <w:right w:val="single" w:color="BBD9D6" w:sz="2" w:space="4"/>
         </w:pBdr>
         <w:shd w:fill="E8F2F1" w:color="auto" w:val="clear"/>
@@ -17095,8 +17095,8 @@
       <w:pPr>
         <w:pBdr>
           <w:top w:val="single" w:color="FFE599" w:sz="2" w:space="4"/>
+          <w:left w:val="single" w:color="C00000" w:sz="18" w:space="6"/>
           <w:bottom w:val="single" w:color="FFE599" w:sz="2" w:space="4"/>
-          <w:left w:val="single" w:color="C00000" w:sz="18" w:space="6"/>
           <w:right w:val="single" w:color="FFE599" w:sz="2" w:space="4"/>
         </w:pBdr>
         <w:shd w:fill="FFF2CC" w:color="auto" w:val="clear"/>
@@ -17134,8 +17134,8 @@
       <w:pPr>
         <w:pBdr>
           <w:top w:val="single" w:color="BBD9D6" w:sz="2" w:space="4"/>
+          <w:left w:val="single" w:color="1F6F6B" w:sz="18" w:space="6"/>
           <w:bottom w:val="single" w:color="BBD9D6" w:sz="2" w:space="4"/>
-          <w:left w:val="single" w:color="1F6F6B" w:sz="18" w:space="6"/>
           <w:right w:val="single" w:color="BBD9D6" w:sz="2" w:space="4"/>
         </w:pBdr>
         <w:shd w:fill="E8F2F1" w:color="auto" w:val="clear"/>
@@ -18082,8 +18082,8 @@
       <w:pPr>
         <w:pBdr>
           <w:top w:val="single" w:color="FFE599" w:sz="2" w:space="4"/>
+          <w:left w:val="single" w:color="C00000" w:sz="18" w:space="6"/>
           <w:bottom w:val="single" w:color="FFE599" w:sz="2" w:space="4"/>
-          <w:left w:val="single" w:color="C00000" w:sz="18" w:space="6"/>
           <w:right w:val="single" w:color="FFE599" w:sz="2" w:space="4"/>
         </w:pBdr>
         <w:shd w:fill="FFF2CC" w:color="auto" w:val="clear"/>
@@ -18121,8 +18121,8 @@
       <w:pPr>
         <w:pBdr>
           <w:top w:val="single" w:color="BBD9D6" w:sz="2" w:space="4"/>
+          <w:left w:val="single" w:color="1F6F6B" w:sz="18" w:space="6"/>
           <w:bottom w:val="single" w:color="BBD9D6" w:sz="2" w:space="4"/>
-          <w:left w:val="single" w:color="1F6F6B" w:sz="18" w:space="6"/>
           <w:right w:val="single" w:color="BBD9D6" w:sz="2" w:space="4"/>
         </w:pBdr>
         <w:shd w:fill="E8F2F1" w:color="auto" w:val="clear"/>
@@ -18994,7 +18994,7 @@
           <w:sz w:val="28"/>
           <w:szCs w:val="28"/>
         </w:rPr>
-        <w:t xml:space="preserve">7.　料金と時間の設計例</w:t>
+        <w:t xml:space="preserve">7.　提供パターン</w:t>
       </w:r>
     </w:p>
     <w:p>
@@ -19012,7 +19012,7 @@
           <w:sz w:val="21"/>
           <w:szCs w:val="21"/>
         </w:rPr>
-        <w:t xml:space="preserve">1対1は講師の時間を直接売る形になるため、準備時間と非同期対応の時間を単価に織り込む必要がある。120分の講義に対し、準備・録画共有・質問対応で実際には40〜70分がかかる。</w:t>
+        <w:t xml:space="preserve">基礎編だけで完結させることも、通しで受講することもできる。途中で通しに切り替えることもできるため、まず基礎編から始める判断で問題ない。</w:t>
       </w:r>
     </w:p>
     <w:p>
@@ -19046,10 +19046,9 @@
         </w:tblBorders>
       </w:tblPr>
       <w:tblGrid>
+        <w:gridCol w:w="2400"/>
         <w:gridCol w:w="2000"/>
-        <w:gridCol w:w="1600"/>
-        <w:gridCol w:w="2400"/>
-        <w:gridCol w:w="2800"/>
+        <w:gridCol w:w="4400"/>
       </w:tblGrid>
       <w:tr>
         <w:trPr>
@@ -19058,7 +19057,7 @@
         </w:trPr>
         <w:tc>
           <w:tcPr>
-            <w:tcW w:type="dxa" w:w="2000"/>
+            <w:tcW w:type="dxa" w:w="2400"/>
             <w:shd w:fill="1F3864" w:color="auto" w:val="clear"/>
             <w:tcMar>
               <w:top w:type="dxa" w:w="70"/>
@@ -19090,7 +19089,7 @@
         </w:tc>
         <w:tc>
           <w:tcPr>
-            <w:tcW w:type="dxa" w:w="1600"/>
+            <w:tcW w:type="dxa" w:w="2000"/>
             <w:shd w:fill="1F3864" w:color="auto" w:val="clear"/>
             <w:tcMar>
               <w:top w:type="dxa" w:w="70"/>
@@ -19122,39 +19121,7 @@
         </w:tc>
         <w:tc>
           <w:tcPr>
-            <w:tcW w:type="dxa" w:w="2400"/>
-            <w:shd w:fill="1F3864" w:color="auto" w:val="clear"/>
-            <w:tcMar>
-              <w:top w:type="dxa" w:w="70"/>
-              <w:left w:type="dxa" w:w="100"/>
-              <w:bottom w:type="dxa" w:w="70"/>
-              <w:right w:type="dxa" w:w="100"/>
-            </w:tcMar>
-            <w:vAlign w:val="center"/>
-          </w:tcPr>
-          <w:p>
-            <w:pPr>
-              <w:spacing w:after="0" w:line="252"/>
-              <w:jc w:val="center"/>
-            </w:pPr>
-            <w:r>
-              <w:rPr>
-                <w:rFonts w:ascii="Yu Gothic" w:cs="Yu Gothic" w:eastAsia="Yu Gothic" w:hAnsi="Yu Gothic"/>
-                <w:b/>
-                <w:bCs/>
-                <w:i w:val="false"/>
-                <w:iCs w:val="false"/>
-                <w:color w:val="FFFFFF"/>
-                <w:sz w:val="19"/>
-                <w:szCs w:val="19"/>
-              </w:rPr>
-              <w:t xml:space="preserve">講師の実働（目安）</w:t>
-            </w:r>
-          </w:p>
-        </w:tc>
-        <w:tc>
-          <w:tcPr>
-            <w:tcW w:type="dxa" w:w="2800"/>
+            <w:tcW w:type="dxa" w:w="4400"/>
             <w:shd w:fill="1F3864" w:color="auto" w:val="clear"/>
             <w:tcMar>
               <w:top w:type="dxa" w:w="70"/>
@@ -19191,6 +19158,37 @@
         </w:trPr>
         <w:tc>
           <w:tcPr>
+            <w:tcW w:type="dxa" w:w="2400"/>
+            <w:tcMar>
+              <w:top w:type="dxa" w:w="70"/>
+              <w:left w:type="dxa" w:w="100"/>
+              <w:bottom w:type="dxa" w:w="70"/>
+              <w:right w:type="dxa" w:w="100"/>
+            </w:tcMar>
+            <w:vAlign w:val="center"/>
+          </w:tcPr>
+          <w:p>
+            <w:pPr>
+              <w:spacing w:after="0" w:line="252"/>
+              <w:jc w:val="left"/>
+            </w:pPr>
+            <w:r>
+              <w:rPr>
+                <w:rFonts w:ascii="Yu Gothic" w:cs="Yu Gothic" w:eastAsia="Yu Gothic" w:hAnsi="Yu Gothic"/>
+                <w:b w:val="false"/>
+                <w:bCs w:val="false"/>
+                <w:i w:val="false"/>
+                <w:iCs w:val="false"/>
+                <w:color w:val="000000"/>
+                <w:sz w:val="18"/>
+                <w:szCs w:val="18"/>
+              </w:rPr>
+              <w:t xml:space="preserve">基礎編のみ</w:t>
+            </w:r>
+          </w:p>
+        </w:tc>
+        <w:tc>
+          <w:tcPr>
             <w:tcW w:type="dxa" w:w="2000"/>
             <w:tcMar>
               <w:top w:type="dxa" w:w="70"/>
@@ -19203,37 +19201,6 @@
           <w:p>
             <w:pPr>
               <w:spacing w:after="0" w:line="252"/>
-              <w:jc w:val="left"/>
-            </w:pPr>
-            <w:r>
-              <w:rPr>
-                <w:rFonts w:ascii="Yu Gothic" w:cs="Yu Gothic" w:eastAsia="Yu Gothic" w:hAnsi="Yu Gothic"/>
-                <w:b w:val="false"/>
-                <w:bCs w:val="false"/>
-                <w:i w:val="false"/>
-                <w:iCs w:val="false"/>
-                <w:color w:val="000000"/>
-                <w:sz w:val="18"/>
-                <w:szCs w:val="18"/>
-              </w:rPr>
-              <w:t xml:space="preserve">基礎編のみ</w:t>
-            </w:r>
-          </w:p>
-        </w:tc>
-        <w:tc>
-          <w:tcPr>
-            <w:tcW w:type="dxa" w:w="1600"/>
-            <w:tcMar>
-              <w:top w:type="dxa" w:w="70"/>
-              <w:left w:type="dxa" w:w="100"/>
-              <w:bottom w:type="dxa" w:w="70"/>
-              <w:right w:type="dxa" w:w="100"/>
-            </w:tcMar>
-            <w:vAlign w:val="center"/>
-          </w:tcPr>
-          <w:p>
-            <w:pPr>
-              <w:spacing w:after="0" w:line="252"/>
               <w:jc w:val="center"/>
             </w:pPr>
             <w:r>
@@ -19253,63 +19220,32 @@
         </w:tc>
         <w:tc>
           <w:tcPr>
-            <w:tcW w:type="dxa" w:w="2400"/>
-            <w:tcMar>
-              <w:top w:type="dxa" w:w="70"/>
-              <w:left w:type="dxa" w:w="100"/>
-              <w:bottom w:type="dxa" w:w="70"/>
-              <w:right w:type="dxa" w:w="100"/>
-            </w:tcMar>
-            <w:vAlign w:val="center"/>
-          </w:tcPr>
-          <w:p>
-            <w:pPr>
-              <w:spacing w:after="0" w:line="252"/>
-              <w:jc w:val="center"/>
-            </w:pPr>
-            <w:r>
-              <w:rPr>
-                <w:rFonts w:ascii="Yu Gothic" w:cs="Yu Gothic" w:eastAsia="Yu Gothic" w:hAnsi="Yu Gothic"/>
-                <w:b w:val="false"/>
-                <w:bCs w:val="false"/>
-                <w:i w:val="false"/>
-                <w:iCs w:val="false"/>
-                <w:color w:val="000000"/>
-                <w:sz w:val="18"/>
-                <w:szCs w:val="18"/>
-              </w:rPr>
-              <w:t xml:space="preserve">1回あたり2.5〜3時間</w:t>
-            </w:r>
-          </w:p>
-        </w:tc>
-        <w:tc>
-          <w:tcPr>
-            <w:tcW w:type="dxa" w:w="2800"/>
-            <w:tcMar>
-              <w:top w:type="dxa" w:w="70"/>
-              <w:left w:type="dxa" w:w="100"/>
-              <w:bottom w:type="dxa" w:w="70"/>
-              <w:right w:type="dxa" w:w="100"/>
-            </w:tcMar>
-            <w:vAlign w:val="center"/>
-          </w:tcPr>
-          <w:p>
-            <w:pPr>
-              <w:spacing w:after="0" w:line="252"/>
-              <w:jc w:val="left"/>
-            </w:pPr>
-            <w:r>
-              <w:rPr>
-                <w:rFonts w:ascii="Yu Gothic" w:cs="Yu Gothic" w:eastAsia="Yu Gothic" w:hAnsi="Yu Gothic"/>
-                <w:b w:val="false"/>
-                <w:bCs w:val="false"/>
-                <w:i w:val="false"/>
-                <w:iCs w:val="false"/>
-                <w:color w:val="000000"/>
-                <w:sz w:val="18"/>
-                <w:szCs w:val="18"/>
-              </w:rPr>
-              <w:t xml:space="preserve">まず試したい／予算を抑えたい</w:t>
+            <w:tcW w:type="dxa" w:w="4400"/>
+            <w:tcMar>
+              <w:top w:type="dxa" w:w="70"/>
+              <w:left w:type="dxa" w:w="100"/>
+              <w:bottom w:type="dxa" w:w="70"/>
+              <w:right w:type="dxa" w:w="100"/>
+            </w:tcMar>
+            <w:vAlign w:val="center"/>
+          </w:tcPr>
+          <w:p>
+            <w:pPr>
+              <w:spacing w:after="0" w:line="252"/>
+              <w:jc w:val="left"/>
+            </w:pPr>
+            <w:r>
+              <w:rPr>
+                <w:rFonts w:ascii="Yu Gothic" w:cs="Yu Gothic" w:eastAsia="Yu Gothic" w:hAnsi="Yu Gothic"/>
+                <w:b w:val="false"/>
+                <w:bCs w:val="false"/>
+                <w:i w:val="false"/>
+                <w:iCs w:val="false"/>
+                <w:color w:val="000000"/>
+                <w:sz w:val="18"/>
+                <w:szCs w:val="18"/>
+              </w:rPr>
+              <w:t xml:space="preserve">まず試したい／自社に合うかを確かめたい</w:t>
             </w:r>
           </w:p>
         </w:tc>
@@ -19320,6 +19256,38 @@
         </w:trPr>
         <w:tc>
           <w:tcPr>
+            <w:tcW w:type="dxa" w:w="2400"/>
+            <w:shd w:fill="F2F2F2" w:color="auto" w:val="clear"/>
+            <w:tcMar>
+              <w:top w:type="dxa" w:w="70"/>
+              <w:left w:type="dxa" w:w="100"/>
+              <w:bottom w:type="dxa" w:w="70"/>
+              <w:right w:type="dxa" w:w="100"/>
+            </w:tcMar>
+            <w:vAlign w:val="center"/>
+          </w:tcPr>
+          <w:p>
+            <w:pPr>
+              <w:spacing w:after="0" w:line="252"/>
+              <w:jc w:val="left"/>
+            </w:pPr>
+            <w:r>
+              <w:rPr>
+                <w:rFonts w:ascii="Yu Gothic" w:cs="Yu Gothic" w:eastAsia="Yu Gothic" w:hAnsi="Yu Gothic"/>
+                <w:b w:val="false"/>
+                <w:bCs w:val="false"/>
+                <w:i w:val="false"/>
+                <w:iCs w:val="false"/>
+                <w:color w:val="000000"/>
+                <w:sz w:val="18"/>
+                <w:szCs w:val="18"/>
+              </w:rPr>
+              <w:t xml:space="preserve">基礎編＋上級2回</w:t>
+            </w:r>
+          </w:p>
+        </w:tc>
+        <w:tc>
+          <w:tcPr>
             <w:tcW w:type="dxa" w:w="2000"/>
             <w:shd w:fill="F2F2F2" w:color="auto" w:val="clear"/>
             <w:tcMar>
@@ -19333,26 +19301,26 @@
           <w:p>
             <w:pPr>
               <w:spacing w:after="0" w:line="252"/>
-              <w:jc w:val="left"/>
-            </w:pPr>
-            <w:r>
-              <w:rPr>
-                <w:rFonts w:ascii="Yu Gothic" w:cs="Yu Gothic" w:eastAsia="Yu Gothic" w:hAnsi="Yu Gothic"/>
-                <w:b w:val="false"/>
-                <w:bCs w:val="false"/>
-                <w:i w:val="false"/>
-                <w:iCs w:val="false"/>
-                <w:color w:val="000000"/>
-                <w:sz w:val="18"/>
-                <w:szCs w:val="18"/>
-              </w:rPr>
-              <w:t xml:space="preserve">基礎編＋上級2回</w:t>
-            </w:r>
-          </w:p>
-        </w:tc>
-        <w:tc>
-          <w:tcPr>
-            <w:tcW w:type="dxa" w:w="1600"/>
+              <w:jc w:val="center"/>
+            </w:pPr>
+            <w:r>
+              <w:rPr>
+                <w:rFonts w:ascii="Yu Gothic" w:cs="Yu Gothic" w:eastAsia="Yu Gothic" w:hAnsi="Yu Gothic"/>
+                <w:b w:val="false"/>
+                <w:bCs w:val="false"/>
+                <w:i w:val="false"/>
+                <w:iCs w:val="false"/>
+                <w:color w:val="000000"/>
+                <w:sz w:val="18"/>
+                <w:szCs w:val="18"/>
+              </w:rPr>
+              <w:t xml:space="preserve">全8回・16時間</w:t>
+            </w:r>
+          </w:p>
+        </w:tc>
+        <w:tc>
+          <w:tcPr>
+            <w:tcW w:type="dxa" w:w="4400"/>
             <w:shd w:fill="F2F2F2" w:color="auto" w:val="clear"/>
             <w:tcMar>
               <w:top w:type="dxa" w:w="70"/>
@@ -19365,84 +19333,20 @@
           <w:p>
             <w:pPr>
               <w:spacing w:after="0" w:line="252"/>
-              <w:jc w:val="center"/>
-            </w:pPr>
-            <w:r>
-              <w:rPr>
-                <w:rFonts w:ascii="Yu Gothic" w:cs="Yu Gothic" w:eastAsia="Yu Gothic" w:hAnsi="Yu Gothic"/>
-                <w:b w:val="false"/>
-                <w:bCs w:val="false"/>
-                <w:i w:val="false"/>
-                <w:iCs w:val="false"/>
-                <w:color w:val="000000"/>
-                <w:sz w:val="18"/>
-                <w:szCs w:val="18"/>
-              </w:rPr>
-              <w:t xml:space="preserve">全8回・16時間</w:t>
-            </w:r>
-          </w:p>
-        </w:tc>
-        <w:tc>
-          <w:tcPr>
-            <w:tcW w:type="dxa" w:w="2400"/>
-            <w:shd w:fill="F2F2F2" w:color="auto" w:val="clear"/>
-            <w:tcMar>
-              <w:top w:type="dxa" w:w="70"/>
-              <w:left w:type="dxa" w:w="100"/>
-              <w:bottom w:type="dxa" w:w="70"/>
-              <w:right w:type="dxa" w:w="100"/>
-            </w:tcMar>
-            <w:vAlign w:val="center"/>
-          </w:tcPr>
-          <w:p>
-            <w:pPr>
-              <w:spacing w:after="0" w:line="252"/>
-              <w:jc w:val="center"/>
-            </w:pPr>
-            <w:r>
-              <w:rPr>
-                <w:rFonts w:ascii="Yu Gothic" w:cs="Yu Gothic" w:eastAsia="Yu Gothic" w:hAnsi="Yu Gothic"/>
-                <w:b w:val="false"/>
-                <w:bCs w:val="false"/>
-                <w:i w:val="false"/>
-                <w:iCs w:val="false"/>
-                <w:color w:val="000000"/>
-                <w:sz w:val="18"/>
-                <w:szCs w:val="18"/>
-              </w:rPr>
-              <w:t xml:space="preserve">1回あたり2.5〜3時間</w:t>
-            </w:r>
-          </w:p>
-        </w:tc>
-        <w:tc>
-          <w:tcPr>
-            <w:tcW w:type="dxa" w:w="2800"/>
-            <w:shd w:fill="F2F2F2" w:color="auto" w:val="clear"/>
-            <w:tcMar>
-              <w:top w:type="dxa" w:w="70"/>
-              <w:left w:type="dxa" w:w="100"/>
-              <w:bottom w:type="dxa" w:w="70"/>
-              <w:right w:type="dxa" w:w="100"/>
-            </w:tcMar>
-            <w:vAlign w:val="center"/>
-          </w:tcPr>
-          <w:p>
-            <w:pPr>
-              <w:spacing w:after="0" w:line="252"/>
-              <w:jc w:val="left"/>
-            </w:pPr>
-            <w:r>
-              <w:rPr>
-                <w:rFonts w:ascii="Yu Gothic" w:cs="Yu Gothic" w:eastAsia="Yu Gothic" w:hAnsi="Yu Gothic"/>
-                <w:b w:val="false"/>
-                <w:bCs w:val="false"/>
-                <w:i w:val="false"/>
-                <w:iCs w:val="false"/>
-                <w:color w:val="000000"/>
-                <w:sz w:val="18"/>
-                <w:szCs w:val="18"/>
-              </w:rPr>
-              <w:t xml:space="preserve">上級の入口まで見たい</w:t>
+              <w:jc w:val="left"/>
+            </w:pPr>
+            <w:r>
+              <w:rPr>
+                <w:rFonts w:ascii="Yu Gothic" w:cs="Yu Gothic" w:eastAsia="Yu Gothic" w:hAnsi="Yu Gothic"/>
+                <w:b w:val="false"/>
+                <w:bCs w:val="false"/>
+                <w:i w:val="false"/>
+                <w:iCs w:val="false"/>
+                <w:color w:val="000000"/>
+                <w:sz w:val="18"/>
+                <w:szCs w:val="18"/>
+              </w:rPr>
+              <w:t xml:space="preserve">上級編の入口まで見ておきたい</w:t>
             </w:r>
           </w:p>
         </w:tc>
@@ -19453,6 +19357,37 @@
         </w:trPr>
         <w:tc>
           <w:tcPr>
+            <w:tcW w:type="dxa" w:w="2400"/>
+            <w:tcMar>
+              <w:top w:type="dxa" w:w="70"/>
+              <w:left w:type="dxa" w:w="100"/>
+              <w:bottom w:type="dxa" w:w="70"/>
+              <w:right w:type="dxa" w:w="100"/>
+            </w:tcMar>
+            <w:vAlign w:val="center"/>
+          </w:tcPr>
+          <w:p>
+            <w:pPr>
+              <w:spacing w:after="0" w:line="252"/>
+              <w:jc w:val="left"/>
+            </w:pPr>
+            <w:r>
+              <w:rPr>
+                <w:rFonts w:ascii="Yu Gothic" w:cs="Yu Gothic" w:eastAsia="Yu Gothic" w:hAnsi="Yu Gothic"/>
+                <w:b w:val="false"/>
+                <w:bCs w:val="false"/>
+                <w:i w:val="false"/>
+                <w:iCs w:val="false"/>
+                <w:color w:val="000000"/>
+                <w:sz w:val="18"/>
+                <w:szCs w:val="18"/>
+              </w:rPr>
+              <w:t xml:space="preserve">通し全12回</w:t>
+            </w:r>
+          </w:p>
+        </w:tc>
+        <w:tc>
+          <w:tcPr>
             <w:tcW w:type="dxa" w:w="2000"/>
             <w:tcMar>
               <w:top w:type="dxa" w:w="70"/>
@@ -19465,37 +19400,6 @@
           <w:p>
             <w:pPr>
               <w:spacing w:after="0" w:line="252"/>
-              <w:jc w:val="left"/>
-            </w:pPr>
-            <w:r>
-              <w:rPr>
-                <w:rFonts w:ascii="Yu Gothic" w:cs="Yu Gothic" w:eastAsia="Yu Gothic" w:hAnsi="Yu Gothic"/>
-                <w:b w:val="false"/>
-                <w:bCs w:val="false"/>
-                <w:i w:val="false"/>
-                <w:iCs w:val="false"/>
-                <w:color w:val="000000"/>
-                <w:sz w:val="18"/>
-                <w:szCs w:val="18"/>
-              </w:rPr>
-              <w:t xml:space="preserve">通し全12回</w:t>
-            </w:r>
-          </w:p>
-        </w:tc>
-        <w:tc>
-          <w:tcPr>
-            <w:tcW w:type="dxa" w:w="1600"/>
-            <w:tcMar>
-              <w:top w:type="dxa" w:w="70"/>
-              <w:left w:type="dxa" w:w="100"/>
-              <w:bottom w:type="dxa" w:w="70"/>
-              <w:right w:type="dxa" w:w="100"/>
-            </w:tcMar>
-            <w:vAlign w:val="center"/>
-          </w:tcPr>
-          <w:p>
-            <w:pPr>
-              <w:spacing w:after="0" w:line="252"/>
               <w:jc w:val="center"/>
             </w:pPr>
             <w:r>
@@ -19515,63 +19419,32 @@
         </w:tc>
         <w:tc>
           <w:tcPr>
-            <w:tcW w:type="dxa" w:w="2400"/>
-            <w:tcMar>
-              <w:top w:type="dxa" w:w="70"/>
-              <w:left w:type="dxa" w:w="100"/>
-              <w:bottom w:type="dxa" w:w="70"/>
-              <w:right w:type="dxa" w:w="100"/>
-            </w:tcMar>
-            <w:vAlign w:val="center"/>
-          </w:tcPr>
-          <w:p>
-            <w:pPr>
-              <w:spacing w:after="0" w:line="252"/>
-              <w:jc w:val="center"/>
-            </w:pPr>
-            <w:r>
-              <w:rPr>
-                <w:rFonts w:ascii="Yu Gothic" w:cs="Yu Gothic" w:eastAsia="Yu Gothic" w:hAnsi="Yu Gothic"/>
-                <w:b w:val="false"/>
-                <w:bCs w:val="false"/>
-                <w:i w:val="false"/>
-                <w:iCs w:val="false"/>
-                <w:color w:val="000000"/>
-                <w:sz w:val="18"/>
-                <w:szCs w:val="18"/>
-              </w:rPr>
-              <w:t xml:space="preserve">1回あたり2.5〜3時間</w:t>
-            </w:r>
-          </w:p>
-        </w:tc>
-        <w:tc>
-          <w:tcPr>
-            <w:tcW w:type="dxa" w:w="2800"/>
-            <w:tcMar>
-              <w:top w:type="dxa" w:w="70"/>
-              <w:left w:type="dxa" w:w="100"/>
-              <w:bottom w:type="dxa" w:w="70"/>
-              <w:right w:type="dxa" w:w="100"/>
-            </w:tcMar>
-            <w:vAlign w:val="center"/>
-          </w:tcPr>
-          <w:p>
-            <w:pPr>
-              <w:spacing w:after="0" w:line="252"/>
-              <w:jc w:val="left"/>
-            </w:pPr>
-            <w:r>
-              <w:rPr>
-                <w:rFonts w:ascii="Yu Gothic" w:cs="Yu Gothic" w:eastAsia="Yu Gothic" w:hAnsi="Yu Gothic"/>
-                <w:b w:val="false"/>
-                <w:bCs w:val="false"/>
-                <w:i w:val="false"/>
-                <w:iCs w:val="false"/>
-                <w:color w:val="000000"/>
-                <w:sz w:val="18"/>
-                <w:szCs w:val="18"/>
-              </w:rPr>
-              <w:t xml:space="preserve">腰を据えて仕組みまで作りたい</w:t>
+            <w:tcW w:type="dxa" w:w="4400"/>
+            <w:tcMar>
+              <w:top w:type="dxa" w:w="70"/>
+              <w:left w:type="dxa" w:w="100"/>
+              <w:bottom w:type="dxa" w:w="70"/>
+              <w:right w:type="dxa" w:w="100"/>
+            </w:tcMar>
+            <w:vAlign w:val="center"/>
+          </w:tcPr>
+          <w:p>
+            <w:pPr>
+              <w:spacing w:after="0" w:line="252"/>
+              <w:jc w:val="left"/>
+            </w:pPr>
+            <w:r>
+              <w:rPr>
+                <w:rFonts w:ascii="Yu Gothic" w:cs="Yu Gothic" w:eastAsia="Yu Gothic" w:hAnsi="Yu Gothic"/>
+                <w:b w:val="false"/>
+                <w:bCs w:val="false"/>
+                <w:i w:val="false"/>
+                <w:iCs w:val="false"/>
+                <w:color w:val="000000"/>
+                <w:sz w:val="18"/>
+                <w:szCs w:val="18"/>
+              </w:rPr>
+              <w:t xml:space="preserve">腰を据えて、社内で回る仕組みまで作りたい</w:t>
             </w:r>
           </w:p>
         </w:tc>
@@ -19582,6 +19455,38 @@
         </w:trPr>
         <w:tc>
           <w:tcPr>
+            <w:tcW w:type="dxa" w:w="2400"/>
+            <w:shd w:fill="F2F2F2" w:color="auto" w:val="clear"/>
+            <w:tcMar>
+              <w:top w:type="dxa" w:w="70"/>
+              <w:left w:type="dxa" w:w="100"/>
+              <w:bottom w:type="dxa" w:w="70"/>
+              <w:right w:type="dxa" w:w="100"/>
+            </w:tcMar>
+            <w:vAlign w:val="center"/>
+          </w:tcPr>
+          <w:p>
+            <w:pPr>
+              <w:spacing w:after="0" w:line="252"/>
+              <w:jc w:val="left"/>
+            </w:pPr>
+            <w:r>
+              <w:rPr>
+                <w:rFonts w:ascii="Yu Gothic" w:cs="Yu Gothic" w:eastAsia="Yu Gothic" w:hAnsi="Yu Gothic"/>
+                <w:b w:val="false"/>
+                <w:bCs w:val="false"/>
+                <w:i w:val="false"/>
+                <w:iCs w:val="false"/>
+                <w:color w:val="000000"/>
+                <w:sz w:val="18"/>
+                <w:szCs w:val="18"/>
+              </w:rPr>
+              <w:t xml:space="preserve">継続伴走</w:t>
+            </w:r>
+          </w:p>
+        </w:tc>
+        <w:tc>
+          <w:tcPr>
             <w:tcW w:type="dxa" w:w="2000"/>
             <w:shd w:fill="F2F2F2" w:color="auto" w:val="clear"/>
             <w:tcMar>
@@ -19595,26 +19500,26 @@
           <w:p>
             <w:pPr>
               <w:spacing w:after="0" w:line="252"/>
-              <w:jc w:val="left"/>
-            </w:pPr>
-            <w:r>
-              <w:rPr>
-                <w:rFonts w:ascii="Yu Gothic" w:cs="Yu Gothic" w:eastAsia="Yu Gothic" w:hAnsi="Yu Gothic"/>
-                <w:b w:val="false"/>
-                <w:bCs w:val="false"/>
-                <w:i w:val="false"/>
-                <w:iCs w:val="false"/>
-                <w:color w:val="000000"/>
-                <w:sz w:val="18"/>
-                <w:szCs w:val="18"/>
-              </w:rPr>
-              <w:t xml:space="preserve">継続伴走</w:t>
-            </w:r>
-          </w:p>
-        </w:tc>
-        <w:tc>
-          <w:tcPr>
-            <w:tcW w:type="dxa" w:w="1600"/>
+              <w:jc w:val="center"/>
+            </w:pPr>
+            <w:r>
+              <w:rPr>
+                <w:rFonts w:ascii="Yu Gothic" w:cs="Yu Gothic" w:eastAsia="Yu Gothic" w:hAnsi="Yu Gothic"/>
+                <w:b w:val="false"/>
+                <w:bCs w:val="false"/>
+                <w:i w:val="false"/>
+                <w:iCs w:val="false"/>
+                <w:color w:val="000000"/>
+                <w:sz w:val="18"/>
+                <w:szCs w:val="18"/>
+              </w:rPr>
+              <w:t xml:space="preserve">月1回または四半期1回</w:t>
+            </w:r>
+          </w:p>
+        </w:tc>
+        <w:tc>
+          <w:tcPr>
+            <w:tcW w:type="dxa" w:w="4400"/>
             <w:shd w:fill="F2F2F2" w:color="auto" w:val="clear"/>
             <w:tcMar>
               <w:top w:type="dxa" w:w="70"/>
@@ -19627,84 +19532,20 @@
           <w:p>
             <w:pPr>
               <w:spacing w:after="0" w:line="252"/>
-              <w:jc w:val="center"/>
-            </w:pPr>
-            <w:r>
-              <w:rPr>
-                <w:rFonts w:ascii="Yu Gothic" w:cs="Yu Gothic" w:eastAsia="Yu Gothic" w:hAnsi="Yu Gothic"/>
-                <w:b w:val="false"/>
-                <w:bCs w:val="false"/>
-                <w:i w:val="false"/>
-                <w:iCs w:val="false"/>
-                <w:color w:val="000000"/>
-                <w:sz w:val="18"/>
-                <w:szCs w:val="18"/>
-              </w:rPr>
-              <w:t xml:space="preserve">月1回または四半期1回</w:t>
-            </w:r>
-          </w:p>
-        </w:tc>
-        <w:tc>
-          <w:tcPr>
-            <w:tcW w:type="dxa" w:w="2400"/>
-            <w:shd w:fill="F2F2F2" w:color="auto" w:val="clear"/>
-            <w:tcMar>
-              <w:top w:type="dxa" w:w="70"/>
-              <w:left w:type="dxa" w:w="100"/>
-              <w:bottom w:type="dxa" w:w="70"/>
-              <w:right w:type="dxa" w:w="100"/>
-            </w:tcMar>
-            <w:vAlign w:val="center"/>
-          </w:tcPr>
-          <w:p>
-            <w:pPr>
-              <w:spacing w:after="0" w:line="252"/>
-              <w:jc w:val="center"/>
-            </w:pPr>
-            <w:r>
-              <w:rPr>
-                <w:rFonts w:ascii="Yu Gothic" w:cs="Yu Gothic" w:eastAsia="Yu Gothic" w:hAnsi="Yu Gothic"/>
-                <w:b w:val="false"/>
-                <w:bCs w:val="false"/>
-                <w:i w:val="false"/>
-                <w:iCs w:val="false"/>
-                <w:color w:val="000000"/>
-                <w:sz w:val="18"/>
-                <w:szCs w:val="18"/>
-              </w:rPr>
-              <w:t xml:space="preserve">1回あたり3時間程度</w:t>
-            </w:r>
-          </w:p>
-        </w:tc>
-        <w:tc>
-          <w:tcPr>
-            <w:tcW w:type="dxa" w:w="2800"/>
-            <w:shd w:fill="F2F2F2" w:color="auto" w:val="clear"/>
-            <w:tcMar>
-              <w:top w:type="dxa" w:w="70"/>
-              <w:left w:type="dxa" w:w="100"/>
-              <w:bottom w:type="dxa" w:w="70"/>
-              <w:right w:type="dxa" w:w="100"/>
-            </w:tcMar>
-            <w:vAlign w:val="center"/>
-          </w:tcPr>
-          <w:p>
-            <w:pPr>
-              <w:spacing w:after="0" w:line="252"/>
-              <w:jc w:val="left"/>
-            </w:pPr>
-            <w:r>
-              <w:rPr>
-                <w:rFonts w:ascii="Yu Gothic" w:cs="Yu Gothic" w:eastAsia="Yu Gothic" w:hAnsi="Yu Gothic"/>
-                <w:b w:val="false"/>
-                <w:bCs w:val="false"/>
-                <w:i w:val="false"/>
-                <w:iCs w:val="false"/>
-                <w:color w:val="000000"/>
-                <w:sz w:val="18"/>
-                <w:szCs w:val="18"/>
-              </w:rPr>
-              <w:t xml:space="preserve">修了後の定着支援</w:t>
+              <w:jc w:val="left"/>
+            </w:pPr>
+            <w:r>
+              <w:rPr>
+                <w:rFonts w:ascii="Yu Gothic" w:cs="Yu Gothic" w:eastAsia="Yu Gothic" w:hAnsi="Yu Gothic"/>
+                <w:b w:val="false"/>
+                <w:bCs w:val="false"/>
+                <w:i w:val="false"/>
+                <w:iCs w:val="false"/>
+                <w:color w:val="000000"/>
+                <w:sz w:val="18"/>
+                <w:szCs w:val="18"/>
+              </w:rPr>
+              <w:t xml:space="preserve">修了後、定着まで見てほしい</w:t>
             </w:r>
           </w:p>
         </w:tc>
@@ -19714,8 +19555,8 @@
       <w:pPr>
         <w:pBdr>
           <w:top w:val="single" w:color="FFE599" w:sz="2" w:space="4"/>
+          <w:left w:val="single" w:color="C00000" w:sz="18" w:space="6"/>
           <w:bottom w:val="single" w:color="FFE599" w:sz="2" w:space="4"/>
-          <w:left w:val="single" w:color="C00000" w:sz="18" w:space="6"/>
           <w:right w:val="single" w:color="FFE599" w:sz="2" w:space="4"/>
         </w:pBdr>
         <w:shd w:fill="FFF2CC" w:color="auto" w:val="clear"/>
@@ -19733,7 +19574,7 @@
           <w:sz w:val="20"/>
           <w:szCs w:val="20"/>
         </w:rPr>
-        <w:t xml:space="preserve">単価を決めるときの考え方　</w:t>
+        <w:t xml:space="preserve">助成金を使う場合　</w:t>
       </w:r>
       <w:r>
         <w:rPr>
@@ -19746,7 +19587,7 @@
           <w:sz w:val="20"/>
           <w:szCs w:val="20"/>
         </w:rPr>
-        <w:t xml:space="preserve">「120分いくら」で考えると必ず安くなります。受講者が持ち帰るのは、12個の成果物と、講師がいなくても回る社内体制です。効果の側から逆算し、そのうえで助成金（中小企業は経費助成75％）を使えば実質負担が下がることを提案時に示してください。金額の妥当性は、成果物イメージの資料が説明してくれます。</w:t>
+        <w:t xml:space="preserve">人材開発支援助成金（事業展開等リスキリング支援コース）は実訓練時間10時間以上が要件のため、上記はいずれも要件を満たします。適用の可否は個社の状況と最新の制度によって変わりますので、管轄の労働局または社会保険労務士にご確認ください。申請の代行は承っておりません。</w:t>
       </w:r>
     </w:p>
     <w:p>

</xml_diff>